<commit_message>
:books: docs: inclusão da documentação final (Word e PDF) para entrega
</commit_message>
<xml_diff>
--- a/ATIVIDADE PRATICA.docx
+++ b/ATIVIDADE PRATICA.docx
@@ -507,8 +507,8 @@
           <w:rFonts w:ascii="Arial" w:hAnsi="Arial" w:cs="Arial"/>
         </w:rPr>
         <w:drawing>
-          <wp:inline distT="0" distB="0" distL="0" distR="0" wp14:anchorId="111C3C2A" wp14:editId="41DFD210">
-            <wp:extent cx="6189345" cy="2094230"/>
+          <wp:inline distT="0" distB="0" distL="0" distR="0" wp14:anchorId="111C3C2A" wp14:editId="08B4D84A">
+            <wp:extent cx="5410200" cy="2094230"/>
             <wp:effectExtent l="0" t="0" r="0" b="1270"/>
             <wp:docPr id="392466169" name="Picture 1"/>
             <wp:cNvGraphicFramePr>
@@ -530,7 +530,7 @@
                   <pic:spPr>
                     <a:xfrm>
                       <a:off x="0" y="0"/>
-                      <a:ext cx="6189345" cy="2094230"/>
+                      <a:ext cx="5410200" cy="2094230"/>
                     </a:xfrm>
                     <a:prstGeom prst="rect">
                       <a:avLst/>
@@ -720,15 +720,11 @@
       <w:pPr>
         <w:rPr>
           <w:rFonts w:ascii="Arial" w:hAnsi="Arial" w:cs="Arial"/>
-          <w:b/>
-          <w:bCs/>
-        </w:rPr>
-      </w:pPr>
-      <w:r>
-        <w:rPr>
-          <w:rFonts w:ascii="Arial" w:hAnsi="Arial" w:cs="Arial"/>
-          <w:b/>
-          <w:bCs/>
+        </w:rPr>
+      </w:pPr>
+      <w:r>
+        <w:rPr>
+          <w:rFonts w:ascii="Arial" w:hAnsi="Arial" w:cs="Arial"/>
         </w:rPr>
         <w:t>A API foi desenvolvida utilizando **Java 17/25** com o framework **Spring Boot 3.2.5**. Para a persistência de dados, utilizou-se **Spring Data JPA** com banco de dados **MySQL**.</w:t>
       </w:r>
@@ -737,50 +733,50 @@
       <w:pPr>
         <w:rPr>
           <w:rFonts w:ascii="Arial" w:hAnsi="Arial" w:cs="Arial"/>
-          <w:b/>
-          <w:bCs/>
-        </w:rPr>
-      </w:pPr>
-    </w:p>
-    <w:p>
-      <w:pPr>
-        <w:rPr>
-          <w:rFonts w:ascii="Arial" w:hAnsi="Arial" w:cs="Arial"/>
-          <w:b/>
-          <w:bCs/>
-        </w:rPr>
-      </w:pPr>
-      <w:r>
-        <w:rPr>
-          <w:rFonts w:ascii="Arial" w:hAnsi="Arial" w:cs="Arial"/>
-          <w:b/>
-          <w:bCs/>
-        </w:rPr>
-        <w:t>**Modelagem de Dados (Entidades):**</w:t>
-      </w:r>
-    </w:p>
-    <w:p>
-      <w:pPr>
-        <w:rPr>
-          <w:rFonts w:ascii="Arial" w:hAnsi="Arial" w:cs="Arial"/>
-          <w:b/>
-          <w:bCs/>
-        </w:rPr>
-      </w:pPr>
-      <w:r>
-        <w:rPr>
-          <w:rFonts w:ascii="Arial" w:hAnsi="Arial" w:cs="Arial"/>
-          <w:b/>
-          <w:bCs/>
-        </w:rPr>
-        <w:t>*   **Cliente:** Atributos `id`, `nome` e `</w:t>
+        </w:rPr>
+      </w:pPr>
+    </w:p>
+    <w:p>
+      <w:pPr>
+        <w:rPr>
+          <w:rFonts w:ascii="Arial" w:hAnsi="Arial" w:cs="Arial"/>
+        </w:rPr>
+      </w:pPr>
+      <w:r>
+        <w:rPr>
+          <w:rFonts w:ascii="Arial" w:hAnsi="Arial" w:cs="Arial"/>
+        </w:rPr>
+        <w:t>Modelagem de Dados (Entidades):</w:t>
+      </w:r>
+    </w:p>
+    <w:p>
+      <w:pPr>
+        <w:rPr>
+          <w:rFonts w:ascii="Arial" w:hAnsi="Arial" w:cs="Arial"/>
+        </w:rPr>
+      </w:pPr>
+      <w:r>
+        <w:rPr>
+          <w:rFonts w:ascii="Arial" w:hAnsi="Arial" w:cs="Arial"/>
+        </w:rPr>
+        <w:t>*   Cliente:</w:t>
+      </w:r>
+      <w:r>
+        <w:rPr>
+          <w:rFonts w:ascii="Arial" w:hAnsi="Arial" w:cs="Arial"/>
+        </w:rPr>
+        <w:t xml:space="preserve"> </w:t>
+      </w:r>
+      <w:r>
+        <w:rPr>
+          <w:rFonts w:ascii="Arial" w:hAnsi="Arial" w:cs="Arial"/>
+        </w:rPr>
+        <w:t>Atributos `id`, `nome` e `</w:t>
       </w:r>
       <w:proofErr w:type="spellStart"/>
       <w:r>
         <w:rPr>
           <w:rFonts w:ascii="Arial" w:hAnsi="Arial" w:cs="Arial"/>
-          <w:b/>
-          <w:bCs/>
         </w:rPr>
         <w:t>clienteDesde</w:t>
       </w:r>
@@ -788,8 +784,6 @@
       <w:r>
         <w:rPr>
           <w:rFonts w:ascii="Arial" w:hAnsi="Arial" w:cs="Arial"/>
-          <w:b/>
-          <w:bCs/>
         </w:rPr>
         <w:t>` (</w:t>
       </w:r>
@@ -797,8 +791,6 @@
       <w:r>
         <w:rPr>
           <w:rFonts w:ascii="Arial" w:hAnsi="Arial" w:cs="Arial"/>
-          <w:b/>
-          <w:bCs/>
         </w:rPr>
         <w:t>LocalDate</w:t>
       </w:r>
@@ -806,8 +798,6 @@
       <w:r>
         <w:rPr>
           <w:rFonts w:ascii="Arial" w:hAnsi="Arial" w:cs="Arial"/>
-          <w:b/>
-          <w:bCs/>
         </w:rPr>
         <w:t>).</w:t>
       </w:r>
@@ -816,24 +806,30 @@
       <w:pPr>
         <w:rPr>
           <w:rFonts w:ascii="Arial" w:hAnsi="Arial" w:cs="Arial"/>
-          <w:b/>
-          <w:bCs/>
-        </w:rPr>
-      </w:pPr>
-      <w:r>
-        <w:rPr>
-          <w:rFonts w:ascii="Arial" w:hAnsi="Arial" w:cs="Arial"/>
-          <w:b/>
-          <w:bCs/>
-        </w:rPr>
-        <w:t>*   **Produto:** Atributos `id`, `nome`, `</w:t>
+        </w:rPr>
+      </w:pPr>
+      <w:r>
+        <w:rPr>
+          <w:rFonts w:ascii="Arial" w:hAnsi="Arial" w:cs="Arial"/>
+        </w:rPr>
+        <w:t>*   Produto:</w:t>
+      </w:r>
+      <w:r>
+        <w:rPr>
+          <w:rFonts w:ascii="Arial" w:hAnsi="Arial" w:cs="Arial"/>
+        </w:rPr>
+        <w:t xml:space="preserve"> </w:t>
+      </w:r>
+      <w:r>
+        <w:rPr>
+          <w:rFonts w:ascii="Arial" w:hAnsi="Arial" w:cs="Arial"/>
+        </w:rPr>
+        <w:t>Atributos `id`, `nome`, `</w:t>
       </w:r>
       <w:proofErr w:type="spellStart"/>
       <w:r>
         <w:rPr>
           <w:rFonts w:ascii="Arial" w:hAnsi="Arial" w:cs="Arial"/>
-          <w:b/>
-          <w:bCs/>
         </w:rPr>
         <w:t>preco</w:t>
       </w:r>
@@ -841,8 +837,6 @@
       <w:r>
         <w:rPr>
           <w:rFonts w:ascii="Arial" w:hAnsi="Arial" w:cs="Arial"/>
-          <w:b/>
-          <w:bCs/>
         </w:rPr>
         <w:t>` (</w:t>
       </w:r>
@@ -850,8 +844,6 @@
       <w:r>
         <w:rPr>
           <w:rFonts w:ascii="Arial" w:hAnsi="Arial" w:cs="Arial"/>
-          <w:b/>
-          <w:bCs/>
         </w:rPr>
         <w:t>BigDecimal</w:t>
       </w:r>
@@ -859,8 +851,6 @@
       <w:r>
         <w:rPr>
           <w:rFonts w:ascii="Arial" w:hAnsi="Arial" w:cs="Arial"/>
-          <w:b/>
-          <w:bCs/>
         </w:rPr>
         <w:t>) e `estoque` (</w:t>
       </w:r>
@@ -868,8 +858,6 @@
       <w:r>
         <w:rPr>
           <w:rFonts w:ascii="Arial" w:hAnsi="Arial" w:cs="Arial"/>
-          <w:b/>
-          <w:bCs/>
         </w:rPr>
         <w:t>Boolean</w:t>
       </w:r>
@@ -877,8 +865,6 @@
       <w:r>
         <w:rPr>
           <w:rFonts w:ascii="Arial" w:hAnsi="Arial" w:cs="Arial"/>
-          <w:b/>
-          <w:bCs/>
         </w:rPr>
         <w:t>).</w:t>
       </w:r>
@@ -887,24 +873,18 @@
       <w:pPr>
         <w:rPr>
           <w:rFonts w:ascii="Arial" w:hAnsi="Arial" w:cs="Arial"/>
-          <w:b/>
-          <w:bCs/>
-        </w:rPr>
-      </w:pPr>
-      <w:r>
-        <w:rPr>
-          <w:rFonts w:ascii="Arial" w:hAnsi="Arial" w:cs="Arial"/>
-          <w:b/>
-          <w:bCs/>
-        </w:rPr>
-        <w:t>*   **Pedido:** Atributos `id`, `cliente` (FK), `produto` (FK) e `quantidade` (</w:t>
+        </w:rPr>
+      </w:pPr>
+      <w:r>
+        <w:rPr>
+          <w:rFonts w:ascii="Arial" w:hAnsi="Arial" w:cs="Arial"/>
+        </w:rPr>
+        <w:t>*   Pedido: Atributos `id`, `cliente` (FK), `produto` (FK) e `quantidade` (</w:t>
       </w:r>
       <w:proofErr w:type="spellStart"/>
       <w:r>
         <w:rPr>
           <w:rFonts w:ascii="Arial" w:hAnsi="Arial" w:cs="Arial"/>
-          <w:b/>
-          <w:bCs/>
         </w:rPr>
         <w:t>Integer</w:t>
       </w:r>
@@ -912,8 +892,6 @@
       <w:r>
         <w:rPr>
           <w:rFonts w:ascii="Arial" w:hAnsi="Arial" w:cs="Arial"/>
-          <w:b/>
-          <w:bCs/>
         </w:rPr>
         <w:t>).</w:t>
       </w:r>
@@ -922,33 +900,25 @@
       <w:pPr>
         <w:rPr>
           <w:rFonts w:ascii="Arial" w:hAnsi="Arial" w:cs="Arial"/>
-          <w:b/>
-          <w:bCs/>
-        </w:rPr>
-      </w:pPr>
-    </w:p>
-    <w:p>
-      <w:pPr>
-        <w:rPr>
-          <w:rFonts w:ascii="Arial" w:hAnsi="Arial" w:cs="Arial"/>
-          <w:b/>
-          <w:bCs/>
-        </w:rPr>
-      </w:pPr>
-      <w:r>
-        <w:rPr>
-          <w:rFonts w:ascii="Arial" w:hAnsi="Arial" w:cs="Arial"/>
-          <w:b/>
-          <w:bCs/>
-        </w:rPr>
-        <w:t xml:space="preserve">**Principais </w:t>
+        </w:rPr>
+      </w:pPr>
+    </w:p>
+    <w:p>
+      <w:pPr>
+        <w:rPr>
+          <w:rFonts w:ascii="Arial" w:hAnsi="Arial" w:cs="Arial"/>
+        </w:rPr>
+      </w:pPr>
+      <w:r>
+        <w:rPr>
+          <w:rFonts w:ascii="Arial" w:hAnsi="Arial" w:cs="Arial"/>
+        </w:rPr>
+        <w:t xml:space="preserve">Principais </w:t>
       </w:r>
       <w:proofErr w:type="spellStart"/>
       <w:r>
         <w:rPr>
           <w:rFonts w:ascii="Arial" w:hAnsi="Arial" w:cs="Arial"/>
-          <w:b/>
-          <w:bCs/>
         </w:rPr>
         <w:t>Endpoints</w:t>
       </w:r>
@@ -956,25 +926,19 @@
       <w:r>
         <w:rPr>
           <w:rFonts w:ascii="Arial" w:hAnsi="Arial" w:cs="Arial"/>
-          <w:b/>
-          <w:bCs/>
-        </w:rPr>
-        <w:t>:**</w:t>
-      </w:r>
-    </w:p>
-    <w:p>
-      <w:pPr>
-        <w:rPr>
-          <w:rFonts w:ascii="Arial" w:hAnsi="Arial" w:cs="Arial"/>
-          <w:b/>
-          <w:bCs/>
-        </w:rPr>
-      </w:pPr>
-      <w:r>
-        <w:rPr>
-          <w:rFonts w:ascii="Arial" w:hAnsi="Arial" w:cs="Arial"/>
-          <w:b/>
-          <w:bCs/>
+        </w:rPr>
+        <w:t>:</w:t>
+      </w:r>
+    </w:p>
+    <w:p>
+      <w:pPr>
+        <w:rPr>
+          <w:rFonts w:ascii="Arial" w:hAnsi="Arial" w:cs="Arial"/>
+        </w:rPr>
+      </w:pPr>
+      <w:r>
+        <w:rPr>
+          <w:rFonts w:ascii="Arial" w:hAnsi="Arial" w:cs="Arial"/>
         </w:rPr>
         <w:t>*   `POST /clientes`: Cadastro de novos usuários.</w:t>
       </w:r>
@@ -983,15 +947,11 @@
       <w:pPr>
         <w:rPr>
           <w:rFonts w:ascii="Arial" w:hAnsi="Arial" w:cs="Arial"/>
-          <w:b/>
-          <w:bCs/>
-        </w:rPr>
-      </w:pPr>
-      <w:r>
-        <w:rPr>
-          <w:rFonts w:ascii="Arial" w:hAnsi="Arial" w:cs="Arial"/>
-          <w:b/>
-          <w:bCs/>
+        </w:rPr>
+      </w:pPr>
+      <w:r>
+        <w:rPr>
+          <w:rFonts w:ascii="Arial" w:hAnsi="Arial" w:cs="Arial"/>
         </w:rPr>
         <w:t>*   `POST /produtos`: Cadastro de itens no catálogo.</w:t>
       </w:r>
@@ -1000,15 +960,11 @@
       <w:pPr>
         <w:rPr>
           <w:rFonts w:ascii="Arial" w:hAnsi="Arial" w:cs="Arial"/>
-          <w:b/>
-          <w:bCs/>
-        </w:rPr>
-      </w:pPr>
-      <w:r>
-        <w:rPr>
-          <w:rFonts w:ascii="Arial" w:hAnsi="Arial" w:cs="Arial"/>
-          <w:b/>
-          <w:bCs/>
+        </w:rPr>
+      </w:pPr>
+      <w:r>
+        <w:rPr>
+          <w:rFonts w:ascii="Arial" w:hAnsi="Arial" w:cs="Arial"/>
         </w:rPr>
         <w:t xml:space="preserve">*   `POST /pedidos`: Registro de vendas vinculando </w:t>
       </w:r>
@@ -1016,8 +972,6 @@
       <w:r>
         <w:rPr>
           <w:rFonts w:ascii="Arial" w:hAnsi="Arial" w:cs="Arial"/>
-          <w:b/>
-          <w:bCs/>
         </w:rPr>
         <w:t>IDs</w:t>
       </w:r>
@@ -1025,8 +979,6 @@
       <w:r>
         <w:rPr>
           <w:rFonts w:ascii="Arial" w:hAnsi="Arial" w:cs="Arial"/>
-          <w:b/>
-          <w:bCs/>
         </w:rPr>
         <w:t xml:space="preserve"> de clientes e produtos.</w:t>
       </w:r>
@@ -1035,15 +987,11 @@
       <w:pPr>
         <w:rPr>
           <w:rFonts w:ascii="Arial" w:hAnsi="Arial" w:cs="Arial"/>
-          <w:b/>
-          <w:bCs/>
-        </w:rPr>
-      </w:pPr>
-      <w:r>
-        <w:rPr>
-          <w:rFonts w:ascii="Arial" w:hAnsi="Arial" w:cs="Arial"/>
-          <w:b/>
-          <w:bCs/>
+        </w:rPr>
+      </w:pPr>
+      <w:r>
+        <w:rPr>
+          <w:rFonts w:ascii="Arial" w:hAnsi="Arial" w:cs="Arial"/>
         </w:rPr>
         <w:t>*   `GET /pedidos`: Listagem completa de vendas com dados relacionais.</w:t>
       </w:r>
@@ -1076,6 +1024,7 @@
           <w:b/>
           <w:bCs/>
         </w:rPr>
+        <w:lastRenderedPageBreak/>
         <w:t xml:space="preserve">Prints do </w:t>
       </w:r>
       <w:proofErr w:type="spellStart"/>
@@ -1102,15 +1051,11 @@
       <w:pPr>
         <w:rPr>
           <w:rFonts w:ascii="Arial" w:hAnsi="Arial" w:cs="Arial"/>
-          <w:b/>
-          <w:bCs/>
-        </w:rPr>
-      </w:pPr>
-      <w:r>
-        <w:rPr>
-          <w:rFonts w:ascii="Arial" w:hAnsi="Arial" w:cs="Arial"/>
-          <w:b/>
-          <w:bCs/>
+        </w:rPr>
+      </w:pPr>
+      <w:r>
+        <w:rPr>
+          <w:rFonts w:ascii="Arial" w:hAnsi="Arial" w:cs="Arial"/>
         </w:rPr>
         <w:t xml:space="preserve">Os prints a seguir comprovam o funcionamento dos </w:t>
       </w:r>
@@ -1118,8 +1063,6 @@
       <w:r>
         <w:rPr>
           <w:rFonts w:ascii="Arial" w:hAnsi="Arial" w:cs="Arial"/>
-          <w:b/>
-          <w:bCs/>
         </w:rPr>
         <w:t>endpoints</w:t>
       </w:r>
@@ -1127,8 +1070,6 @@
       <w:r>
         <w:rPr>
           <w:rFonts w:ascii="Arial" w:hAnsi="Arial" w:cs="Arial"/>
-          <w:b/>
-          <w:bCs/>
         </w:rPr>
         <w:t xml:space="preserve"> solicitados (Arquivos disponíveis na pasta `</w:t>
       </w:r>
@@ -1136,8 +1077,6 @@
       <w:r>
         <w:rPr>
           <w:rFonts w:ascii="Arial" w:hAnsi="Arial" w:cs="Arial"/>
-          <w:b/>
-          <w:bCs/>
         </w:rPr>
         <w:t>documentacao</w:t>
       </w:r>
@@ -1145,8 +1084,6 @@
       <w:r>
         <w:rPr>
           <w:rFonts w:ascii="Arial" w:hAnsi="Arial" w:cs="Arial"/>
-          <w:b/>
-          <w:bCs/>
         </w:rPr>
         <w:t>/prints/`):</w:t>
       </w:r>
@@ -1181,6 +1118,15 @@
         </w:rPr>
         <w:t>**POST Cliente:** `01_post_cliente.png` (Cadastro do aluno Matheus Fagundes)</w:t>
       </w:r>
+    </w:p>
+    <w:p>
+      <w:pPr>
+        <w:rPr>
+          <w:rFonts w:ascii="Arial" w:hAnsi="Arial" w:cs="Arial"/>
+          <w:b/>
+          <w:bCs/>
+        </w:rPr>
+      </w:pPr>
     </w:p>
     <w:p>
       <w:pPr>
@@ -1244,6 +1190,15 @@
     </w:p>
     <w:p>
       <w:pPr>
+        <w:rPr>
+          <w:rFonts w:ascii="Arial" w:hAnsi="Arial" w:cs="Arial"/>
+          <w:b/>
+          <w:bCs/>
+        </w:rPr>
+      </w:pPr>
+    </w:p>
+    <w:p>
+      <w:pPr>
         <w:pStyle w:val="ListParagraph"/>
         <w:numPr>
           <w:ilvl w:val="0"/>
@@ -1298,7 +1253,7 @@
         </w:rPr>
         <w:lastRenderedPageBreak/>
         <w:drawing>
-          <wp:inline distT="0" distB="0" distL="0" distR="0" wp14:anchorId="41380A98" wp14:editId="703B6737">
+          <wp:inline distT="0" distB="0" distL="0" distR="0" wp14:anchorId="41380A98" wp14:editId="27BBD7AA">
             <wp:extent cx="6189345" cy="3886835"/>
             <wp:effectExtent l="0" t="0" r="0" b="0"/>
             <wp:docPr id="1915828160" name="Picture 1"/>
@@ -1364,6 +1319,15 @@
         </w:rPr>
         <w:t>**POST Pedido:** `03_post_pedido.png` (Criação da venda vinculada)</w:t>
       </w:r>
+    </w:p>
+    <w:p>
+      <w:pPr>
+        <w:rPr>
+          <w:rFonts w:ascii="Arial" w:hAnsi="Arial" w:cs="Arial"/>
+          <w:b/>
+          <w:bCs/>
+        </w:rPr>
+      </w:pPr>
     </w:p>
     <w:p>
       <w:pPr>
@@ -1427,6 +1391,24 @@
     </w:p>
     <w:p>
       <w:pPr>
+        <w:rPr>
+          <w:rFonts w:ascii="Arial" w:hAnsi="Arial" w:cs="Arial"/>
+          <w:b/>
+          <w:bCs/>
+        </w:rPr>
+      </w:pPr>
+    </w:p>
+    <w:p>
+      <w:pPr>
+        <w:rPr>
+          <w:rFonts w:ascii="Arial" w:hAnsi="Arial" w:cs="Arial"/>
+          <w:b/>
+          <w:bCs/>
+        </w:rPr>
+      </w:pPr>
+    </w:p>
+    <w:p>
+      <w:pPr>
         <w:pStyle w:val="ListParagraph"/>
         <w:numPr>
           <w:ilvl w:val="0"/>
@@ -1444,6 +1426,7 @@
           <w:b/>
           <w:bCs/>
         </w:rPr>
+        <w:lastRenderedPageBreak/>
         <w:t>**GET Pedidos:** `04_get_listagem_pedidos.png` (Consulta geral de registros)</w:t>
       </w:r>
     </w:p>
@@ -1470,7 +1453,6 @@
           <w:b/>
           <w:bCs/>
         </w:rPr>
-        <w:lastRenderedPageBreak/>
         <w:drawing>
           <wp:inline distT="0" distB="0" distL="0" distR="0" wp14:anchorId="5E1F57EA" wp14:editId="58C6C8AC">
             <wp:extent cx="6189345" cy="3865245"/>
@@ -1565,8 +1547,8 @@
           <w:bCs/>
         </w:rPr>
         <w:drawing>
-          <wp:inline distT="0" distB="0" distL="0" distR="0" wp14:anchorId="6518E2F0" wp14:editId="7E533196">
-            <wp:extent cx="6189345" cy="3852545"/>
+          <wp:inline distT="0" distB="0" distL="0" distR="0" wp14:anchorId="6518E2F0" wp14:editId="26DFB3F8">
+            <wp:extent cx="5733331" cy="3568700"/>
             <wp:effectExtent l="0" t="0" r="0" b="0"/>
             <wp:docPr id="588200513" name="Picture 1"/>
             <wp:cNvGraphicFramePr>
@@ -1588,7 +1570,7 @@
                   <pic:spPr>
                     <a:xfrm>
                       <a:off x="0" y="0"/>
-                      <a:ext cx="6189345" cy="3852545"/>
+                      <a:ext cx="5739406" cy="3572481"/>
                     </a:xfrm>
                     <a:prstGeom prst="rect">
                       <a:avLst/>
@@ -1603,6 +1585,16 @@
     </w:p>
     <w:p>
       <w:pPr>
+        <w:pStyle w:val="ListParagraph"/>
+        <w:rPr>
+          <w:rFonts w:ascii="Arial" w:hAnsi="Arial" w:cs="Arial"/>
+          <w:b/>
+          <w:bCs/>
+        </w:rPr>
+      </w:pPr>
+    </w:p>
+    <w:p>
+      <w:pPr>
         <w:rPr>
           <w:rFonts w:ascii="Arial" w:hAnsi="Arial" w:cs="Arial"/>
           <w:b/>
@@ -1629,6 +1621,7 @@
           <w:b/>
           <w:bCs/>
         </w:rPr>
+        <w:lastRenderedPageBreak/>
         <w:t>**Erro de Integridade:** `06_delete_produto_falha_integridade.png` (Proteção do banco contra exclusão de produtos com pedidos)</w:t>
       </w:r>
     </w:p>
@@ -1646,7 +1639,6 @@
           <w:b/>
           <w:bCs/>
         </w:rPr>
-        <w:lastRenderedPageBreak/>
         <w:drawing>
           <wp:inline distT="0" distB="0" distL="0" distR="0" wp14:anchorId="2E96EEB3" wp14:editId="1AE6C1C3">
             <wp:extent cx="6189345" cy="3860165"/>
@@ -1800,32 +1792,6 @@
           <w:rFonts w:ascii="Arial" w:hAnsi="Arial" w:cs="Arial"/>
           <w:b/>
           <w:bCs/>
-        </w:rPr>
-      </w:pPr>
-    </w:p>
-    <w:p>
-      <w:pPr>
-        <w:rPr>
-          <w:rFonts w:ascii="Arial" w:hAnsi="Arial" w:cs="Arial"/>
-          <w:b/>
-          <w:bCs/>
-        </w:rPr>
-      </w:pPr>
-      <w:r>
-        <w:rPr>
-          <w:rFonts w:ascii="Arial" w:hAnsi="Arial" w:cs="Arial"/>
-          <w:b/>
-          <w:bCs/>
-        </w:rPr>
-        <w:t>---</w:t>
-      </w:r>
-    </w:p>
-    <w:p>
-      <w:pPr>
-        <w:rPr>
-          <w:rFonts w:ascii="Arial" w:hAnsi="Arial" w:cs="Arial"/>
-          <w:b/>
-          <w:bCs/>
           <w:color w:val="EE0000"/>
         </w:rPr>
       </w:pPr>
@@ -1848,7 +1814,6 @@
           <w:rFonts w:ascii="Arial" w:hAnsi="Arial" w:cs="Arial"/>
           <w:b/>
           <w:bCs/>
-          <w:highlight w:val="yellow"/>
         </w:rPr>
         <w:t xml:space="preserve">Link do repositório (GitHub ou similar) contendo o </w:t>
       </w:r>
@@ -1858,7 +1823,6 @@
           <w:rFonts w:ascii="Arial" w:hAnsi="Arial" w:cs="Arial"/>
           <w:b/>
           <w:bCs/>
-          <w:highlight w:val="yellow"/>
         </w:rPr>
         <w:t>projeto(</w:t>
       </w:r>
@@ -1868,9 +1832,78 @@
           <w:rFonts w:ascii="Arial" w:hAnsi="Arial" w:cs="Arial"/>
           <w:b/>
           <w:bCs/>
-          <w:highlight w:val="yellow"/>
         </w:rPr>
         <w:t>código fonte)</w:t>
+      </w:r>
+    </w:p>
+    <w:p>
+      <w:pPr>
+        <w:rPr>
+          <w:rFonts w:ascii="Arial" w:hAnsi="Arial" w:cs="Arial"/>
+          <w:b/>
+          <w:bCs/>
+        </w:rPr>
+      </w:pPr>
+    </w:p>
+    <w:p>
+      <w:pPr>
+        <w:rPr>
+          <w:rFonts w:ascii="Arial" w:hAnsi="Arial" w:cs="Arial"/>
+          <w:b/>
+          <w:bCs/>
+        </w:rPr>
+      </w:pPr>
+      <w:r>
+        <w:rPr>
+          <w:rFonts w:ascii="Arial" w:hAnsi="Arial" w:cs="Arial"/>
+          <w:b/>
+          <w:bCs/>
+        </w:rPr>
+        <w:t xml:space="preserve">O código fonte completo da API REST, incluindo a estrutura de pacotes, as entidades JPA, os repositórios, </w:t>
+      </w:r>
+      <w:proofErr w:type="spellStart"/>
+      <w:r>
+        <w:rPr>
+          <w:rFonts w:ascii="Arial" w:hAnsi="Arial" w:cs="Arial"/>
+          <w:b/>
+          <w:bCs/>
+        </w:rPr>
+        <w:t>controllers</w:t>
+      </w:r>
+      <w:proofErr w:type="spellEnd"/>
+      <w:r>
+        <w:rPr>
+          <w:rFonts w:ascii="Arial" w:hAnsi="Arial" w:cs="Arial"/>
+          <w:b/>
+          <w:bCs/>
+        </w:rPr>
+        <w:t xml:space="preserve"> e os prints de teste, está disponível publicamente no seguinte endereço:</w:t>
+      </w:r>
+    </w:p>
+    <w:p>
+      <w:pPr>
+        <w:rPr>
+          <w:rFonts w:ascii="Arial" w:hAnsi="Arial" w:cs="Arial"/>
+          <w:b/>
+          <w:bCs/>
+        </w:rPr>
+      </w:pPr>
+    </w:p>
+    <w:p>
+      <w:pPr>
+        <w:rPr>
+          <w:rFonts w:ascii="Arial" w:hAnsi="Arial" w:cs="Arial"/>
+          <w:b/>
+          <w:bCs/>
+        </w:rPr>
+      </w:pPr>
+      <w:r>
+        <w:rPr>
+          <w:rFonts w:ascii="Arial" w:hAnsi="Arial" w:cs="Arial"/>
+          <w:b/>
+          <w:bCs/>
+        </w:rPr>
+        <w:t>Link: https://github.com/Aveiromat/api-rest-baozi-store</w:t>
       </w:r>
     </w:p>
     <w:sectPr>

</xml_diff>